<commit_message>
Update advanced certificate documents
</commit_message>
<xml_diff>
--- a/03. Advanced Certificate in Cybersecurity Operations Analyst/Advanced Certificate in Cybersecurity Operations Analyst.docx
+++ b/03. Advanced Certificate in Cybersecurity Operations Analyst/Advanced Certificate in Cybersecurity Operations Analyst.docx
@@ -1,6 +1,6 @@
 
 <file path=word/document.xml><?xml version="1.0" encoding="utf-8"?>
-<w:document xmlns:wpc="http://schemas.microsoft.com/office/word/2010/wordprocessingCanvas" xmlns:cx="http://schemas.microsoft.com/office/drawing/2014/chartex" xmlns:cx1="http://schemas.microsoft.com/office/drawing/2015/9/8/chartex" xmlns:cx2="http://schemas.microsoft.com/office/drawing/2015/10/21/chartex" xmlns:cx3="http://schemas.microsoft.com/office/drawing/2016/5/9/chartex" xmlns:cx4="http://schemas.microsoft.com/office/drawing/2016/5/10/chartex" xmlns:cx5="http://schemas.microsoft.com/office/drawing/2016/5/11/chartex" xmlns:cx6="http://schemas.microsoft.com/office/drawing/2016/5/12/chartex" xmlns:cx7="http://schemas.microsoft.com/office/drawing/2016/5/13/chartex" xmlns:cx8="http://schemas.microsoft.com/office/drawing/2016/5/14/chartex" xmlns:mc="http://schemas.openxmlformats.org/markup-compatibility/2006" xmlns:aink="http://schemas.microsoft.com/office/drawing/2016/ink" xmlns:am3d="http://schemas.microsoft.com/office/drawing/2017/model3d" xmlns:o="urn:schemas-microsoft-com:office:office" xmlns:oel="http://schemas.microsoft.com/office/2019/extlst" xmlns:r="http://schemas.openxmlformats.org/officeDocument/2006/relationships" xmlns:m="http://schemas.openxmlformats.org/officeDocument/2006/math" xmlns:v="urn:schemas-microsoft-com:vml" xmlns:wp14="http://schemas.microsoft.com/office/word/2010/wordprocessingDrawing" xmlns:wp="http://schemas.openxmlformats.org/drawingml/2006/wordprocessingDrawing" xmlns:w10="urn:schemas-microsoft-com:office:word" xmlns:w="http://schemas.openxmlformats.org/wordprocessingml/2006/main" xmlns:w14="http://schemas.microsoft.com/office/word/2010/wordml" xmlns:w15="http://schemas.microsoft.com/office/word/2012/wordml" xmlns:w16cex="http://schemas.microsoft.com/office/word/2018/wordml/cex" xmlns:w16cid="http://schemas.microsoft.com/office/word/2016/wordml/cid" xmlns:w16="http://schemas.microsoft.com/office/word/2018/wordml" xmlns:w16du="http://schemas.microsoft.com/office/word/2023/wordml/word16du" xmlns:w16sdtdh="http://schemas.microsoft.com/office/word/2020/wordml/sdtdatahash" xmlns:w16sdtfl="http://schemas.microsoft.com/office/word/2024/wordml/sdtformatlock" xmlns:w16se="http://schemas.microsoft.com/office/word/2015/wordml/symex" xmlns:wpg="http://schemas.microsoft.com/office/word/2010/wordprocessingGroup" xmlns:wpi="http://schemas.microsoft.com/office/word/2010/wordprocessingInk" xmlns:wne="http://schemas.microsoft.com/office/word/2006/wordml" xmlns:wps="http://schemas.microsoft.com/office/word/2010/wordprocessingShape" mc:Ignorable="w14 w15 w16se w16cid w16 w16cex w16sdtdh w16sdtfl w16du wp14">
+<w:document xmlns:wpc="http://schemas.microsoft.com/office/word/2010/wordprocessingCanvas" xmlns:cx="http://schemas.microsoft.com/office/drawing/2014/chartex" xmlns:cx1="http://schemas.microsoft.com/office/drawing/2015/9/8/chartex" xmlns:cx2="http://schemas.microsoft.com/office/drawing/2015/10/21/chartex" xmlns:cx3="http://schemas.microsoft.com/office/drawing/2016/5/9/chartex" xmlns:cx4="http://schemas.microsoft.com/office/drawing/2016/5/10/chartex" xmlns:cx5="http://schemas.microsoft.com/office/drawing/2016/5/11/chartex" xmlns:cx6="http://schemas.microsoft.com/office/drawing/2016/5/12/chartex" xmlns:cx7="http://schemas.microsoft.com/office/drawing/2016/5/13/chartex" xmlns:cx8="http://schemas.microsoft.com/office/drawing/2016/5/14/chartex" xmlns:mc="http://schemas.openxmlformats.org/markup-compatibility/2006" xmlns:m="http://schemas.openxmlformats.org/officeDocument/2006/math" xmlns:aink="http://schemas.microsoft.com/office/drawing/2016/ink" xmlns:am3d="http://schemas.microsoft.com/office/drawing/2017/model3d" xmlns:oel="http://schemas.microsoft.com/office/2019/extlst" xmlns:r="http://schemas.openxmlformats.org/officeDocument/2006/relationships" xmlns:wp14="http://schemas.microsoft.com/office/word/2010/wordprocessingDrawing" xmlns:wp="http://schemas.openxmlformats.org/drawingml/2006/wordprocessingDrawing" xmlns:wpg="http://schemas.microsoft.com/office/word/2010/wordprocessingGroup" xmlns:wpi="http://schemas.microsoft.com/office/word/2010/wordprocessingInk" xmlns:wps="http://schemas.microsoft.com/office/word/2010/wordprocessingShape" xmlns:o="urn:schemas-microsoft-com:office:office" xmlns:v="urn:schemas-microsoft-com:vml" xmlns:w10="urn:schemas-microsoft-com:office:word" xmlns:w="http://schemas.openxmlformats.org/wordprocessingml/2006/main" xmlns:w14="http://schemas.microsoft.com/office/word/2010/wordml" xmlns:w15="http://schemas.microsoft.com/office/word/2012/wordml" xmlns:w16cex="http://schemas.microsoft.com/office/word/2018/wordml/cex" xmlns:w16cid="http://schemas.microsoft.com/office/word/2016/wordml/cid" xmlns:w16="http://schemas.microsoft.com/office/word/2018/wordml" xmlns:w16sdtdh="http://schemas.microsoft.com/office/word/2020/wordml/sdtdatahash" xmlns:w16sdtfl="http://schemas.microsoft.com/office/word/2024/wordml/sdtformatlock" xmlns:w16se="http://schemas.microsoft.com/office/word/2015/wordml/symex" xmlns:w16du="http://schemas.microsoft.com/office/word/2023/wordml/word16du" xmlns:wne="http://schemas.microsoft.com/office/word/2006/wordml" mc:Ignorable="w14 w15 w16se w16cid w16 w16cex w16sdtdh w16sdtfl w16du wp14">
   <w:body>
     <w:p>
       <w:pPr>
@@ -140,12 +140,14 @@
             <w:pPr>
               <w:spacing w:after="40"/>
             </w:pPr>
+            <w:bookmarkStart w:id="0" w:name="OLE_LINK52"/>
             <w:r>
               <w:rPr>
                 <w:b/>
               </w:rPr>
               <w:t>Advanced Certificate in Cybersecurity Operations Analyst</w:t>
             </w:r>
+            <w:bookmarkEnd w:id="0"/>
           </w:p>
         </w:tc>
       </w:tr>
@@ -498,12 +500,14 @@
                   <w:pPr>
                     <w:spacing w:after="40"/>
                   </w:pPr>
+                  <w:bookmarkStart w:id="1" w:name="OLE_LINK54"/>
                   <w:r>
                     <w:rPr>
                       <w:b/>
                     </w:rPr>
                     <w:t>Module 1: Foundations of IT and Cloud Infrastructure</w:t>
                   </w:r>
+                  <w:bookmarkEnd w:id="1"/>
                 </w:p>
               </w:tc>
               <w:tc>
@@ -542,12 +546,14 @@
                   <w:pPr>
                     <w:spacing w:after="40"/>
                   </w:pPr>
+                  <w:bookmarkStart w:id="2" w:name="OLE_LINK55"/>
                   <w:r>
                     <w:rPr>
                       <w:b/>
                     </w:rPr>
                     <w:t>Module 2: Security Monitoring and Incident Handling</w:t>
                   </w:r>
+                  <w:bookmarkEnd w:id="2"/>
                 </w:p>
               </w:tc>
               <w:tc>
@@ -559,15 +565,7 @@
                     <w:spacing w:after="40"/>
                   </w:pPr>
                   <w:r>
-                    <w:t xml:space="preserve">Learners will be able to detect incidents using data analytics, detection use cases, indicators of compromise/attack, logs, alerts and monitoring tools; and respond </w:t>
-                  </w:r>
-                  <w:proofErr w:type="gramStart"/>
-                  <w:r>
-                    <w:t>to incidents through</w:t>
-                  </w:r>
-                  <w:proofErr w:type="gramEnd"/>
-                  <w:r>
-                    <w:t xml:space="preserve"> incident handling and containment, forensic analysis, malware analysis, network traffic and packet analysis, and threat analysis.</w:t>
+                    <w:t>Learners will be able to detect incidents using data analytics, detection use cases, indicators of compromise/attack, logs, alerts and monitoring tools; and respond to incidents through incident handling and containment, forensic analysis, malware analysis, network traffic and packet analysis, and threat analysis.</w:t>
                   </w:r>
                 </w:p>
               </w:tc>
@@ -594,12 +592,14 @@
                   <w:pPr>
                     <w:spacing w:after="40"/>
                   </w:pPr>
+                  <w:bookmarkStart w:id="3" w:name="OLE_LINK56"/>
                   <w:r>
                     <w:rPr>
                       <w:b/>
                     </w:rPr>
                     <w:t>Module 3: Governance, Risk and Compliance Fundamentals</w:t>
                   </w:r>
+                  <w:bookmarkEnd w:id="3"/>
                 </w:p>
               </w:tc>
               <w:tc>
@@ -638,12 +638,14 @@
                   <w:pPr>
                     <w:spacing w:after="40"/>
                   </w:pPr>
+                  <w:bookmarkStart w:id="4" w:name="OLE_LINK57"/>
                   <w:r>
                     <w:rPr>
                       <w:b/>
                     </w:rPr>
                     <w:t>Module 4: Protective Controls and Vulnerability Management</w:t>
                   </w:r>
+                  <w:bookmarkEnd w:id="4"/>
                 </w:p>
               </w:tc>
               <w:tc>
@@ -682,6 +684,7 @@
                   <w:pPr>
                     <w:spacing w:after="40"/>
                   </w:pPr>
+                  <w:bookmarkStart w:id="5" w:name="OLE_LINK58"/>
                   <w:r>
                     <w:rPr>
                       <w:b/>
@@ -695,6 +698,7 @@
                     <w:lastRenderedPageBreak/>
                     <w:t>Intelligence and Adversary Analysis</w:t>
                   </w:r>
+                  <w:bookmarkEnd w:id="5"/>
                 </w:p>
               </w:tc>
               <w:tc>
@@ -711,15 +715,7 @@
                   </w:r>
                   <w:r>
                     <w:lastRenderedPageBreak/>
-                    <w:t xml:space="preserve">including attack vectors, threat actors and threat intelligence sources; and </w:t>
-                  </w:r>
-                  <w:proofErr w:type="gramStart"/>
-                  <w:r>
-                    <w:t>understand</w:t>
-                  </w:r>
-                  <w:proofErr w:type="gramEnd"/>
-                  <w:r>
-                    <w:t xml:space="preserve"> adversary means and methods including attack types, cyber attack stages, exploit techniques and penetration testing.</w:t>
+                    <w:t>including attack vectors, threat actors and threat intelligence sources; and understand adversary means and methods including attack types, cyber attack stages, exploit techniques and penetration testing.</w:t>
                   </w:r>
                 </w:p>
               </w:tc>
@@ -802,21 +798,7 @@
               <w:rPr>
                 <w:bCs/>
               </w:rPr>
-              <w:t xml:space="preserve">Cybersecurity practitioners </w:t>
-            </w:r>
-            <w:proofErr w:type="gramStart"/>
-            <w:r>
-              <w:rPr>
-                <w:bCs/>
-              </w:rPr>
-              <w:t>seeking</w:t>
-            </w:r>
-            <w:proofErr w:type="gramEnd"/>
-            <w:r>
-              <w:rPr>
-                <w:bCs/>
-              </w:rPr>
-              <w:t xml:space="preserve"> to strengthen their threat detection, monitoring and response capabilities.</w:t>
+              <w:t>Cybersecurity practitioners seeking to strengthen their threat detection, monitoring and response capabilities.</w:t>
             </w:r>
           </w:p>
           <w:p>
@@ -908,21 +890,7 @@
               <w:rPr>
                 <w:bCs/>
               </w:rPr>
-              <w:t xml:space="preserve">Technical managers or team </w:t>
-            </w:r>
-            <w:proofErr w:type="gramStart"/>
-            <w:r>
-              <w:rPr>
-                <w:bCs/>
-              </w:rPr>
-              <w:t>leads who</w:t>
-            </w:r>
-            <w:proofErr w:type="gramEnd"/>
-            <w:r>
-              <w:rPr>
-                <w:bCs/>
-              </w:rPr>
-              <w:t xml:space="preserve"> need a strong cybersecurity operations foundation to guide their teams or projects.</w:t>
+              <w:t>Technical managers or team leads who need a strong cybersecurity operations foundation to guide their teams or projects.</w:t>
             </w:r>
           </w:p>
         </w:tc>
@@ -1150,21 +1118,7 @@
               <w:rPr>
                 <w:i/>
               </w:rPr>
-              <w:t xml:space="preserve">If yes, please state the location of PEI's </w:t>
-            </w:r>
-            <w:proofErr w:type="gramStart"/>
-            <w:r>
-              <w:rPr>
-                <w:i/>
-              </w:rPr>
-              <w:t>premise</w:t>
-            </w:r>
-            <w:proofErr w:type="gramEnd"/>
-            <w:r>
-              <w:rPr>
-                <w:i/>
-              </w:rPr>
-              <w:t xml:space="preserve"> for the course to be conducted in: N/A</w:t>
+              <w:t>If yes, please state the location of PEI's premise for the course to be conducted in: N/A</w:t>
             </w:r>
           </w:p>
         </w:tc>
@@ -1200,19 +1154,11 @@
                 <w:bCs/>
               </w:rPr>
             </w:pPr>
-            <w:proofErr w:type="gramStart"/>
             <w:r>
               <w:rPr>
                 <w:bCs/>
               </w:rPr>
-              <w:t>Mode of Delivery:  ☐</w:t>
-            </w:r>
-            <w:proofErr w:type="gramEnd"/>
-            <w:r>
-              <w:rPr>
-                <w:bCs/>
-              </w:rPr>
-              <w:t xml:space="preserve"> Face-to-face    ☐ Blended    √ E-learning</w:t>
+              <w:t>Mode of Delivery:  ☐ Face-to-face    ☐ Blended    √ E-learning</w:t>
             </w:r>
           </w:p>
           <w:p>
@@ -1240,21 +1186,7 @@
               <w:rPr>
                 <w:bCs/>
               </w:rPr>
-              <w:t>Duration</w:t>
-            </w:r>
-            <w:proofErr w:type="gramStart"/>
-            <w:r>
-              <w:rPr>
-                <w:bCs/>
-              </w:rPr>
-              <w:t>:  ~</w:t>
-            </w:r>
-            <w:proofErr w:type="gramEnd"/>
-            <w:r>
-              <w:rPr>
-                <w:bCs/>
-              </w:rPr>
-              <w:t>4 months (part-time)</w:t>
+              <w:t>Duration:  ~4 months (part-time)</w:t>
             </w:r>
           </w:p>
           <w:p>
@@ -1296,21 +1228,7 @@
               <w:rPr>
                 <w:bCs/>
               </w:rPr>
-              <w:t>Total Course Hours</w:t>
-            </w:r>
-            <w:proofErr w:type="gramStart"/>
-            <w:r>
-              <w:rPr>
-                <w:bCs/>
-              </w:rPr>
-              <w:t>:  150</w:t>
-            </w:r>
-            <w:proofErr w:type="gramEnd"/>
-            <w:r>
-              <w:rPr>
-                <w:bCs/>
-              </w:rPr>
-              <w:t xml:space="preserve"> hours (part-time)</w:t>
+              <w:t>Total Course Hours:  150 hours (part-time)</w:t>
             </w:r>
           </w:p>
           <w:p>
@@ -1321,21 +1239,7 @@
               <w:rPr>
                 <w:bCs/>
               </w:rPr>
-              <w:t>Computation for course hours</w:t>
-            </w:r>
-            <w:proofErr w:type="gramStart"/>
-            <w:r>
-              <w:rPr>
-                <w:bCs/>
-              </w:rPr>
-              <w:t>:  5</w:t>
-            </w:r>
-            <w:proofErr w:type="gramEnd"/>
-            <w:r>
-              <w:rPr>
-                <w:bCs/>
-              </w:rPr>
-              <w:t xml:space="preserve"> modules x 10 sessions x 3 hours = 150 hours.</w:t>
+              <w:t>Computation for course hours:  5 modules x 10 sessions x 3 hours = 150 hours.</w:t>
             </w:r>
           </w:p>
           <w:tbl>
@@ -1832,6 +1736,7 @@
                 <w:bCs/>
               </w:rPr>
             </w:pPr>
+            <w:bookmarkStart w:id="6" w:name="OLE_LINK53"/>
             <w:r>
               <w:rPr>
                 <w:bCs/>
@@ -1888,6 +1793,7 @@
               </w:rPr>
               <w:t>Mature candidate who is at least 25 years old with at least 4 years of working experience</w:t>
             </w:r>
+            <w:bookmarkEnd w:id="6"/>
           </w:p>
         </w:tc>
       </w:tr>
@@ -2540,7 +2446,7 @@
 </file>
 
 <file path=word/numbering.xml><?xml version="1.0" encoding="utf-8"?>
-<w:numbering xmlns:wpc="http://schemas.microsoft.com/office/word/2010/wordprocessingCanvas" xmlns:cx="http://schemas.microsoft.com/office/drawing/2014/chartex" xmlns:cx1="http://schemas.microsoft.com/office/drawing/2015/9/8/chartex" xmlns:cx2="http://schemas.microsoft.com/office/drawing/2015/10/21/chartex" xmlns:cx3="http://schemas.microsoft.com/office/drawing/2016/5/9/chartex" xmlns:cx4="http://schemas.microsoft.com/office/drawing/2016/5/10/chartex" xmlns:cx5="http://schemas.microsoft.com/office/drawing/2016/5/11/chartex" xmlns:cx6="http://schemas.microsoft.com/office/drawing/2016/5/12/chartex" xmlns:cx7="http://schemas.microsoft.com/office/drawing/2016/5/13/chartex" xmlns:cx8="http://schemas.microsoft.com/office/drawing/2016/5/14/chartex" xmlns:mc="http://schemas.openxmlformats.org/markup-compatibility/2006" xmlns:aink="http://schemas.microsoft.com/office/drawing/2016/ink" xmlns:am3d="http://schemas.microsoft.com/office/drawing/2017/model3d" xmlns:o="urn:schemas-microsoft-com:office:office" xmlns:oel="http://schemas.microsoft.com/office/2019/extlst" xmlns:r="http://schemas.openxmlformats.org/officeDocument/2006/relationships" xmlns:m="http://schemas.openxmlformats.org/officeDocument/2006/math" xmlns:v="urn:schemas-microsoft-com:vml" xmlns:wp14="http://schemas.microsoft.com/office/word/2010/wordprocessingDrawing" xmlns:wp="http://schemas.openxmlformats.org/drawingml/2006/wordprocessingDrawing" xmlns:w10="urn:schemas-microsoft-com:office:word" xmlns:w="http://schemas.openxmlformats.org/wordprocessingml/2006/main" xmlns:w14="http://schemas.microsoft.com/office/word/2010/wordml" xmlns:w15="http://schemas.microsoft.com/office/word/2012/wordml" xmlns:w16cex="http://schemas.microsoft.com/office/word/2018/wordml/cex" xmlns:w16cid="http://schemas.microsoft.com/office/word/2016/wordml/cid" xmlns:w16="http://schemas.microsoft.com/office/word/2018/wordml" xmlns:w16du="http://schemas.microsoft.com/office/word/2023/wordml/word16du" xmlns:w16sdtdh="http://schemas.microsoft.com/office/word/2020/wordml/sdtdatahash" xmlns:w16sdtfl="http://schemas.microsoft.com/office/word/2024/wordml/sdtformatlock" xmlns:w16se="http://schemas.microsoft.com/office/word/2015/wordml/symex" xmlns:wpg="http://schemas.microsoft.com/office/word/2010/wordprocessingGroup" xmlns:wpi="http://schemas.microsoft.com/office/word/2010/wordprocessingInk" xmlns:wne="http://schemas.microsoft.com/office/word/2006/wordml" xmlns:wps="http://schemas.microsoft.com/office/word/2010/wordprocessingShape" mc:Ignorable="w14 w15 w16se w16cid w16 w16cex w16sdtdh w16sdtfl w16du wp14">
+<w:numbering xmlns:wpc="http://schemas.microsoft.com/office/word/2010/wordprocessingCanvas" xmlns:cx="http://schemas.microsoft.com/office/drawing/2014/chartex" xmlns:cx1="http://schemas.microsoft.com/office/drawing/2015/9/8/chartex" xmlns:cx2="http://schemas.microsoft.com/office/drawing/2015/10/21/chartex" xmlns:cx3="http://schemas.microsoft.com/office/drawing/2016/5/9/chartex" xmlns:cx4="http://schemas.microsoft.com/office/drawing/2016/5/10/chartex" xmlns:cx5="http://schemas.microsoft.com/office/drawing/2016/5/11/chartex" xmlns:cx6="http://schemas.microsoft.com/office/drawing/2016/5/12/chartex" xmlns:cx7="http://schemas.microsoft.com/office/drawing/2016/5/13/chartex" xmlns:cx8="http://schemas.microsoft.com/office/drawing/2016/5/14/chartex" xmlns:mc="http://schemas.openxmlformats.org/markup-compatibility/2006" xmlns:m="http://schemas.openxmlformats.org/officeDocument/2006/math" xmlns:aink="http://schemas.microsoft.com/office/drawing/2016/ink" xmlns:am3d="http://schemas.microsoft.com/office/drawing/2017/model3d" xmlns:oel="http://schemas.microsoft.com/office/2019/extlst" xmlns:r="http://schemas.openxmlformats.org/officeDocument/2006/relationships" xmlns:wp14="http://schemas.microsoft.com/office/word/2010/wordprocessingDrawing" xmlns:wp="http://schemas.openxmlformats.org/drawingml/2006/wordprocessingDrawing" xmlns:wpg="http://schemas.microsoft.com/office/word/2010/wordprocessingGroup" xmlns:wpi="http://schemas.microsoft.com/office/word/2010/wordprocessingInk" xmlns:wps="http://schemas.microsoft.com/office/word/2010/wordprocessingShape" xmlns:o="urn:schemas-microsoft-com:office:office" xmlns:v="urn:schemas-microsoft-com:vml" xmlns:w10="urn:schemas-microsoft-com:office:word" xmlns:w="http://schemas.openxmlformats.org/wordprocessingml/2006/main" xmlns:w14="http://schemas.microsoft.com/office/word/2010/wordml" xmlns:w15="http://schemas.microsoft.com/office/word/2012/wordml" xmlns:w16cex="http://schemas.microsoft.com/office/word/2018/wordml/cex" xmlns:w16cid="http://schemas.microsoft.com/office/word/2016/wordml/cid" xmlns:w16="http://schemas.microsoft.com/office/word/2018/wordml" xmlns:w16sdtdh="http://schemas.microsoft.com/office/word/2020/wordml/sdtdatahash" xmlns:w16sdtfl="http://schemas.microsoft.com/office/word/2024/wordml/sdtformatlock" xmlns:w16se="http://schemas.microsoft.com/office/word/2015/wordml/symex" xmlns:w16du="http://schemas.microsoft.com/office/word/2023/wordml/word16du" xmlns:wne="http://schemas.microsoft.com/office/word/2006/wordml" mc:Ignorable="w14 w15 w16se w16cid w16 w16cex w16sdtdh w16sdtfl w16du wp14">
   <w:abstractNum w:abstractNumId="0" w15:restartNumberingAfterBreak="0">
     <w:nsid w:val="FFFFFF7C"/>
     <w:multiLevelType w:val="singleLevel"/>
@@ -2975,7 +2881,7 @@
 </file>
 
 <file path=word/styles.xml><?xml version="1.0" encoding="utf-8"?>
-<w:styles xmlns:mc="http://schemas.openxmlformats.org/markup-compatibility/2006" xmlns:r="http://schemas.openxmlformats.org/officeDocument/2006/relationships" xmlns:w="http://schemas.openxmlformats.org/wordprocessingml/2006/main" xmlns:w14="http://schemas.microsoft.com/office/word/2010/wordml" xmlns:w15="http://schemas.microsoft.com/office/word/2012/wordml" xmlns:w16cex="http://schemas.microsoft.com/office/word/2018/wordml/cex" xmlns:w16cid="http://schemas.microsoft.com/office/word/2016/wordml/cid" xmlns:w16="http://schemas.microsoft.com/office/word/2018/wordml" xmlns:w16du="http://schemas.microsoft.com/office/word/2023/wordml/word16du" xmlns:w16sdtdh="http://schemas.microsoft.com/office/word/2020/wordml/sdtdatahash" xmlns:w16sdtfl="http://schemas.microsoft.com/office/word/2024/wordml/sdtformatlock" xmlns:w16se="http://schemas.microsoft.com/office/word/2015/wordml/symex" mc:Ignorable="w14 w15 w16se w16cid w16 w16cex w16sdtdh w16sdtfl w16du">
+<w:styles xmlns:mc="http://schemas.openxmlformats.org/markup-compatibility/2006" xmlns:r="http://schemas.openxmlformats.org/officeDocument/2006/relationships" xmlns:w="http://schemas.openxmlformats.org/wordprocessingml/2006/main" xmlns:w14="http://schemas.microsoft.com/office/word/2010/wordml" xmlns:w15="http://schemas.microsoft.com/office/word/2012/wordml" xmlns:w16cex="http://schemas.microsoft.com/office/word/2018/wordml/cex" xmlns:w16cid="http://schemas.microsoft.com/office/word/2016/wordml/cid" xmlns:w16="http://schemas.microsoft.com/office/word/2018/wordml" xmlns:w16sdtdh="http://schemas.microsoft.com/office/word/2020/wordml/sdtdatahash" xmlns:w16sdtfl="http://schemas.microsoft.com/office/word/2024/wordml/sdtformatlock" xmlns:w16se="http://schemas.microsoft.com/office/word/2015/wordml/symex" xmlns:w16du="http://schemas.microsoft.com/office/word/2023/wordml/word16du" mc:Ignorable="w14 w15 w16se w16cid w16 w16cex w16sdtdh w16sdtfl w16du">
   <w:docDefaults>
     <w:rPrDefault>
       <w:rPr>
@@ -12498,7 +12404,7 @@
       </w:tcPr>
     </w:tblStylePr>
   </w:style>
-  <w:style w:type="table" w:styleId="ColorfulShading">
+  <w:style w:type="table" w:styleId="ColourfulShading">
     <w:name w:val="Colorful Shading"/>
     <w:basedOn w:val="TableNormal"/>
     <w:uiPriority w:val="71"/>
@@ -12613,7 +12519,7 @@
       </w:rPr>
     </w:tblStylePr>
   </w:style>
-  <w:style w:type="table" w:styleId="ColorfulShading-Accent1">
+  <w:style w:type="table" w:styleId="ColourfulShadingAccent1">
     <w:name w:val="Colorful Shading Accent 1"/>
     <w:basedOn w:val="TableNormal"/>
     <w:uiPriority w:val="71"/>
@@ -12728,7 +12634,7 @@
       </w:rPr>
     </w:tblStylePr>
   </w:style>
-  <w:style w:type="table" w:styleId="ColorfulShading-Accent2">
+  <w:style w:type="table" w:styleId="ColourfulShadingAccent2">
     <w:name w:val="Colorful Shading Accent 2"/>
     <w:basedOn w:val="TableNormal"/>
     <w:uiPriority w:val="71"/>
@@ -12843,7 +12749,7 @@
       </w:rPr>
     </w:tblStylePr>
   </w:style>
-  <w:style w:type="table" w:styleId="ColorfulShading-Accent3">
+  <w:style w:type="table" w:styleId="ColourfulShadingAccent3">
     <w:name w:val="Colorful Shading Accent 3"/>
     <w:basedOn w:val="TableNormal"/>
     <w:uiPriority w:val="71"/>
@@ -12948,7 +12854,7 @@
       </w:tcPr>
     </w:tblStylePr>
   </w:style>
-  <w:style w:type="table" w:styleId="ColorfulShading-Accent4">
+  <w:style w:type="table" w:styleId="ColourfulShadingAccent4">
     <w:name w:val="Colorful Shading Accent 4"/>
     <w:basedOn w:val="TableNormal"/>
     <w:uiPriority w:val="71"/>
@@ -13063,7 +12969,7 @@
       </w:rPr>
     </w:tblStylePr>
   </w:style>
-  <w:style w:type="table" w:styleId="ColorfulShading-Accent5">
+  <w:style w:type="table" w:styleId="ColourfulShadingAccent5">
     <w:name w:val="Colorful Shading Accent 5"/>
     <w:basedOn w:val="TableNormal"/>
     <w:uiPriority w:val="71"/>
@@ -13178,7 +13084,7 @@
       </w:rPr>
     </w:tblStylePr>
   </w:style>
-  <w:style w:type="table" w:styleId="ColorfulShading-Accent6">
+  <w:style w:type="table" w:styleId="ColourfulShadingAccent6">
     <w:name w:val="Colorful Shading Accent 6"/>
     <w:basedOn w:val="TableNormal"/>
     <w:uiPriority w:val="71"/>
@@ -13293,7 +13199,7 @@
       </w:rPr>
     </w:tblStylePr>
   </w:style>
-  <w:style w:type="table" w:styleId="ColorfulList">
+  <w:style w:type="table" w:styleId="ColourfulList">
     <w:name w:val="Colorful List"/>
     <w:basedOn w:val="TableNormal"/>
     <w:uiPriority w:val="72"/>
@@ -13372,7 +13278,7 @@
       </w:tcPr>
     </w:tblStylePr>
   </w:style>
-  <w:style w:type="table" w:styleId="ColorfulList-Accent1">
+  <w:style w:type="table" w:styleId="ColourfulListAccent1">
     <w:name w:val="Colorful List Accent 1"/>
     <w:basedOn w:val="TableNormal"/>
     <w:uiPriority w:val="72"/>
@@ -13451,7 +13357,7 @@
       </w:tcPr>
     </w:tblStylePr>
   </w:style>
-  <w:style w:type="table" w:styleId="ColorfulList-Accent2">
+  <w:style w:type="table" w:styleId="ColourfulListAccent2">
     <w:name w:val="Colorful List Accent 2"/>
     <w:basedOn w:val="TableNormal"/>
     <w:uiPriority w:val="72"/>
@@ -13530,7 +13436,7 @@
       </w:tcPr>
     </w:tblStylePr>
   </w:style>
-  <w:style w:type="table" w:styleId="ColorfulList-Accent3">
+  <w:style w:type="table" w:styleId="ColourfulListAccent3">
     <w:name w:val="Colorful List Accent 3"/>
     <w:basedOn w:val="TableNormal"/>
     <w:uiPriority w:val="72"/>
@@ -13609,7 +13515,7 @@
       </w:tcPr>
     </w:tblStylePr>
   </w:style>
-  <w:style w:type="table" w:styleId="ColorfulList-Accent4">
+  <w:style w:type="table" w:styleId="ColourfulListAccent4">
     <w:name w:val="Colorful List Accent 4"/>
     <w:basedOn w:val="TableNormal"/>
     <w:uiPriority w:val="72"/>
@@ -13688,7 +13594,7 @@
       </w:tcPr>
     </w:tblStylePr>
   </w:style>
-  <w:style w:type="table" w:styleId="ColorfulList-Accent5">
+  <w:style w:type="table" w:styleId="ColourfulListAccent5">
     <w:name w:val="Colorful List Accent 5"/>
     <w:basedOn w:val="TableNormal"/>
     <w:uiPriority w:val="72"/>
@@ -13767,7 +13673,7 @@
       </w:tcPr>
     </w:tblStylePr>
   </w:style>
-  <w:style w:type="table" w:styleId="ColorfulList-Accent6">
+  <w:style w:type="table" w:styleId="ColourfulListAccent6">
     <w:name w:val="Colorful List Accent 6"/>
     <w:basedOn w:val="TableNormal"/>
     <w:uiPriority w:val="72"/>
@@ -13846,7 +13752,7 @@
       </w:tcPr>
     </w:tblStylePr>
   </w:style>
-  <w:style w:type="table" w:styleId="ColorfulGrid">
+  <w:style w:type="table" w:styleId="ColourfulGrid">
     <w:name w:val="Colorful Grid"/>
     <w:basedOn w:val="TableNormal"/>
     <w:uiPriority w:val="73"/>
@@ -13919,7 +13825,7 @@
       </w:tcPr>
     </w:tblStylePr>
   </w:style>
-  <w:style w:type="table" w:styleId="ColorfulGrid-Accent1">
+  <w:style w:type="table" w:styleId="ColourfulGridAccent1">
     <w:name w:val="Colorful Grid Accent 1"/>
     <w:basedOn w:val="TableNormal"/>
     <w:uiPriority w:val="73"/>
@@ -13992,7 +13898,7 @@
       </w:tcPr>
     </w:tblStylePr>
   </w:style>
-  <w:style w:type="table" w:styleId="ColorfulGrid-Accent2">
+  <w:style w:type="table" w:styleId="ColourfulGridAccent2">
     <w:name w:val="Colorful Grid Accent 2"/>
     <w:basedOn w:val="TableNormal"/>
     <w:uiPriority w:val="73"/>
@@ -14065,7 +13971,7 @@
       </w:tcPr>
     </w:tblStylePr>
   </w:style>
-  <w:style w:type="table" w:styleId="ColorfulGrid-Accent3">
+  <w:style w:type="table" w:styleId="ColourfulGridAccent3">
     <w:name w:val="Colorful Grid Accent 3"/>
     <w:basedOn w:val="TableNormal"/>
     <w:uiPriority w:val="73"/>
@@ -14138,7 +14044,7 @@
       </w:tcPr>
     </w:tblStylePr>
   </w:style>
-  <w:style w:type="table" w:styleId="ColorfulGrid-Accent4">
+  <w:style w:type="table" w:styleId="ColourfulGridAccent4">
     <w:name w:val="Colorful Grid Accent 4"/>
     <w:basedOn w:val="TableNormal"/>
     <w:uiPriority w:val="73"/>
@@ -14211,7 +14117,7 @@
       </w:tcPr>
     </w:tblStylePr>
   </w:style>
-  <w:style w:type="table" w:styleId="ColorfulGrid-Accent5">
+  <w:style w:type="table" w:styleId="ColourfulGridAccent5">
     <w:name w:val="Colorful Grid Accent 5"/>
     <w:basedOn w:val="TableNormal"/>
     <w:uiPriority w:val="73"/>
@@ -14284,7 +14190,7 @@
       </w:tcPr>
     </w:tblStylePr>
   </w:style>
-  <w:style w:type="table" w:styleId="ColorfulGrid-Accent6">
+  <w:style w:type="table" w:styleId="ColourfulGridAccent6">
     <w:name w:val="Colorful Grid Accent 6"/>
     <w:basedOn w:val="TableNormal"/>
     <w:uiPriority w:val="73"/>

</xml_diff>